<commit_message>
docs(objective_1): Update Technical Report to include spatial map visualizations
</commit_message>
<xml_diff>
--- a/objective_1/model_a/artifacts/ISRO_Hackathon_Objective1_Report.docx
+++ b/objective_1/model_a/artifacts/ISRO_Hackathon_Objective1_Report.docx
@@ -6907,6 +6907,288 @@
     <w:p>
       <w:r>
         <w:br w:type="page"/>
+      </w:r>
+    </w:p>
+    <w:p>
+      <w:pPr>
+        <w:pStyle w:val="Heading2"/>
+        <w:spacing w:after="120" w:before="300"/>
+        <w:rPr>
+          <w:b/>
+          <w:bCs/>
+          <w:color w:val="2E4057"/>
+          <w:sz w:val="26"/>
+          <w:szCs w:val="26"/>
+        </w:rPr>
+      </w:pPr>
+      <w:r>
+        <w:t xml:space="preserve">2.8 Spatial Predictions &amp; Visualizations</w:t>
+      </w:r>
+    </w:p>
+    <w:p>
+      <w:pPr>
+        <w:spacing w:after="120"/>
+        <w:jc w:val="both"/>
+      </w:pPr>
+      <w:r>
+        <w:rPr>
+          <w:b w:val="false"/>
+          <w:bCs w:val="false"/>
+          <w:i w:val="false"/>
+          <w:iCs w:val="false"/>
+          <w:color w:val="1A1A1A"/>
+          <w:sz w:val="22"/>
+          <w:szCs w:val="22"/>
+        </w:rPr>
+        <w:t xml:space="preserve">The following maps display the continuous 0.25� grid predictions generated by the Model A pipeline. These visuals demonstrate the model's ability to smoothly interpolate and extrapolate pollution concentrations beyond the 100 CPCB ground stations, accurately capturing hotspot geometries and regional transport patterns.</w:t>
+      </w:r>
+    </w:p>
+    <w:p>
+      <w:pPr>
+        <w:pStyle w:val="Heading3"/>
+        <w:spacing w:after="80" w:before="200"/>
+        <w:rPr>
+          <w:b/>
+          <w:bCs/>
+          <w:color w:val="E84855"/>
+          <w:sz w:val="22"/>
+          <w:szCs w:val="22"/>
+        </w:rPr>
+      </w:pPr>
+      <w:r>
+        <w:t xml:space="preserve">PM2.5 Seasonal Mean (Oct 2023 - Jan 2024)</w:t>
+      </w:r>
+    </w:p>
+    <w:p>
+      <w:pPr>
+        <w:spacing w:after="200" w:before="200"/>
+        <w:jc w:val="center"/>
+      </w:pPr>
+      <w:r>
+        <w:drawing>
+          <wp:inline distT="0" distB="0" distL="0" distR="0">
+            <wp:extent cx="5715000" cy="4286250"/>
+            <wp:effectExtent t="0" r="0" b="0" l="0"/>
+            <wp:docPr id="1" name="" descr="" title=""/>
+            <wp:cNvGraphicFramePr>
+              <a:graphicFrameLocks xmlns:a="http://schemas.openxmlformats.org/drawingml/2006/main" noChangeAspect="1"/>
+            </wp:cNvGraphicFramePr>
+            <a:graphic xmlns:a="http://schemas.openxmlformats.org/drawingml/2006/main">
+              <a:graphicData uri="http://schemas.openxmlformats.org/drawingml/2006/picture">
+                <pic:pic xmlns:pic="http://schemas.openxmlformats.org/drawingml/2006/picture">
+                  <pic:nvPicPr>
+                    <pic:cNvPr id="0" name="" descr=""/>
+                    <pic:cNvPicPr>
+                      <a:picLocks noChangeAspect="1" noChangeArrowheads="1"/>
+                    </pic:cNvPicPr>
+                  </pic:nvPicPr>
+                  <pic:blipFill>
+                    <a:blip r:embed="rId7" cstate="none"/>
+                    <a:srcRect/>
+                    <a:stretch>
+                      <a:fillRect/>
+                    </a:stretch>
+                  </pic:blipFill>
+                  <pic:spPr bwMode="auto">
+                    <a:xfrm>
+                      <a:off x="0" y="0"/>
+                      <a:ext cx="5715000" cy="4286250"/>
+                    </a:xfrm>
+                    <a:prstGeom prst="rect">
+                      <a:avLst/>
+                    </a:prstGeom>
+                  </pic:spPr>
+                </pic:pic>
+              </a:graphicData>
+            </a:graphic>
+          </wp:inline>
+        </w:drawing>
+      </w:r>
+    </w:p>
+    <w:p>
+      <w:pPr>
+        <w:pStyle w:val="Heading3"/>
+        <w:spacing w:after="80" w:before="200"/>
+        <w:rPr>
+          <w:b/>
+          <w:bCs/>
+          <w:color w:val="E84855"/>
+          <w:sz w:val="22"/>
+          <w:szCs w:val="22"/>
+        </w:rPr>
+      </w:pPr>
+      <w:r>
+        <w:t xml:space="preserve">PM2.5 Concentration - Severe Event (Nov 5, 2023)</w:t>
+      </w:r>
+    </w:p>
+    <w:p>
+      <w:pPr>
+        <w:spacing w:after="200" w:before="200"/>
+        <w:jc w:val="center"/>
+      </w:pPr>
+      <w:r>
+        <w:drawing>
+          <wp:inline distT="0" distB="0" distL="0" distR="0">
+            <wp:extent cx="5715000" cy="4286250"/>
+            <wp:effectExtent t="0" r="0" b="0" l="0"/>
+            <wp:docPr id="1" name="" descr="" title=""/>
+            <wp:cNvGraphicFramePr>
+              <a:graphicFrameLocks xmlns:a="http://schemas.openxmlformats.org/drawingml/2006/main" noChangeAspect="1"/>
+            </wp:cNvGraphicFramePr>
+            <a:graphic xmlns:a="http://schemas.openxmlformats.org/drawingml/2006/main">
+              <a:graphicData uri="http://schemas.openxmlformats.org/drawingml/2006/picture">
+                <pic:pic xmlns:pic="http://schemas.openxmlformats.org/drawingml/2006/picture">
+                  <pic:nvPicPr>
+                    <pic:cNvPr id="0" name="" descr=""/>
+                    <pic:cNvPicPr>
+                      <a:picLocks noChangeAspect="1" noChangeArrowheads="1"/>
+                    </pic:cNvPicPr>
+                  </pic:nvPicPr>
+                  <pic:blipFill>
+                    <a:blip r:embed="rId8" cstate="none"/>
+                    <a:srcRect/>
+                    <a:stretch>
+                      <a:fillRect/>
+                    </a:stretch>
+                  </pic:blipFill>
+                  <pic:spPr bwMode="auto">
+                    <a:xfrm>
+                      <a:off x="0" y="0"/>
+                      <a:ext cx="5715000" cy="4286250"/>
+                    </a:xfrm>
+                    <a:prstGeom prst="rect">
+                      <a:avLst/>
+                    </a:prstGeom>
+                  </pic:spPr>
+                </pic:pic>
+              </a:graphicData>
+            </a:graphic>
+          </wp:inline>
+        </w:drawing>
+      </w:r>
+    </w:p>
+    <w:p>
+      <w:pPr>
+        <w:pStyle w:val="Heading3"/>
+        <w:spacing w:after="80" w:before="200"/>
+        <w:rPr>
+          <w:b/>
+          <w:bCs/>
+          <w:color w:val="E84855"/>
+          <w:sz w:val="22"/>
+          <w:szCs w:val="22"/>
+        </w:rPr>
+      </w:pPr>
+      <w:r>
+        <w:t xml:space="preserve">NO2 Concentration - Peak Point (Nov 5, 2023)</w:t>
+      </w:r>
+    </w:p>
+    <w:p>
+      <w:pPr>
+        <w:spacing w:after="200" w:before="200"/>
+        <w:jc w:val="center"/>
+      </w:pPr>
+      <w:r>
+        <w:drawing>
+          <wp:inline distT="0" distB="0" distL="0" distR="0">
+            <wp:extent cx="5715000" cy="4286250"/>
+            <wp:effectExtent t="0" r="0" b="0" l="0"/>
+            <wp:docPr id="1" name="" descr="" title=""/>
+            <wp:cNvGraphicFramePr>
+              <a:graphicFrameLocks xmlns:a="http://schemas.openxmlformats.org/drawingml/2006/main" noChangeAspect="1"/>
+            </wp:cNvGraphicFramePr>
+            <a:graphic xmlns:a="http://schemas.openxmlformats.org/drawingml/2006/main">
+              <a:graphicData uri="http://schemas.openxmlformats.org/drawingml/2006/picture">
+                <pic:pic xmlns:pic="http://schemas.openxmlformats.org/drawingml/2006/picture">
+                  <pic:nvPicPr>
+                    <pic:cNvPr id="0" name="" descr=""/>
+                    <pic:cNvPicPr>
+                      <a:picLocks noChangeAspect="1" noChangeArrowheads="1"/>
+                    </pic:cNvPicPr>
+                  </pic:nvPicPr>
+                  <pic:blipFill>
+                    <a:blip r:embed="rId9" cstate="none"/>
+                    <a:srcRect/>
+                    <a:stretch>
+                      <a:fillRect/>
+                    </a:stretch>
+                  </pic:blipFill>
+                  <pic:spPr bwMode="auto">
+                    <a:xfrm>
+                      <a:off x="0" y="0"/>
+                      <a:ext cx="5715000" cy="4286250"/>
+                    </a:xfrm>
+                    <a:prstGeom prst="rect">
+                      <a:avLst/>
+                    </a:prstGeom>
+                  </pic:spPr>
+                </pic:pic>
+              </a:graphicData>
+            </a:graphic>
+          </wp:inline>
+        </w:drawing>
+      </w:r>
+    </w:p>
+    <w:p>
+      <w:pPr>
+        <w:pStyle w:val="Heading3"/>
+        <w:spacing w:after="80" w:before="200"/>
+        <w:rPr>
+          <w:b/>
+          <w:bCs/>
+          <w:color w:val="E84855"/>
+          <w:sz w:val="22"/>
+          <w:szCs w:val="22"/>
+        </w:rPr>
+      </w:pPr>
+      <w:r>
+        <w:t xml:space="preserve">AQI Dominant Pollutant (Spatial Distribution)</w:t>
+      </w:r>
+    </w:p>
+    <w:p>
+      <w:pPr>
+        <w:spacing w:after="200" w:before="200"/>
+        <w:jc w:val="center"/>
+      </w:pPr>
+      <w:r>
+        <w:drawing>
+          <wp:inline distT="0" distB="0" distL="0" distR="0">
+            <wp:extent cx="5715000" cy="4286250"/>
+            <wp:effectExtent t="0" r="0" b="0" l="0"/>
+            <wp:docPr id="1" name="" descr="" title=""/>
+            <wp:cNvGraphicFramePr>
+              <a:graphicFrameLocks xmlns:a="http://schemas.openxmlformats.org/drawingml/2006/main" noChangeAspect="1"/>
+            </wp:cNvGraphicFramePr>
+            <a:graphic xmlns:a="http://schemas.openxmlformats.org/drawingml/2006/main">
+              <a:graphicData uri="http://schemas.openxmlformats.org/drawingml/2006/picture">
+                <pic:pic xmlns:pic="http://schemas.openxmlformats.org/drawingml/2006/picture">
+                  <pic:nvPicPr>
+                    <pic:cNvPr id="0" name="" descr=""/>
+                    <pic:cNvPicPr>
+                      <a:picLocks noChangeAspect="1" noChangeArrowheads="1"/>
+                    </pic:cNvPicPr>
+                  </pic:nvPicPr>
+                  <pic:blipFill>
+                    <a:blip r:embed="rId10" cstate="none"/>
+                    <a:srcRect/>
+                    <a:stretch>
+                      <a:fillRect/>
+                    </a:stretch>
+                  </pic:blipFill>
+                  <pic:spPr bwMode="auto">
+                    <a:xfrm>
+                      <a:off x="0" y="0"/>
+                      <a:ext cx="5715000" cy="4286250"/>
+                    </a:xfrm>
+                    <a:prstGeom prst="rect">
+                      <a:avLst/>
+                    </a:prstGeom>
+                  </pic:spPr>
+                </pic:pic>
+              </a:graphicData>
+            </a:graphic>
+          </wp:inline>
+        </w:drawing>
       </w:r>
     </w:p>
     <w:p>

</xml_diff>